<commit_message>
Improve review pagination and refresh contents
</commit_message>
<xml_diff>
--- a/Doi_chieu_Nhom_2_Nhom_A/BTL_Nhom_2_Bo_sung_va_danh_dau.docx
+++ b/Doi_chieu_Nhom_2_Nhom_A/BTL_Nhom_2_Bo_sung_va_danh_dau.docx
@@ -2076,7 +2076,7 @@
           <w:lang w:val="vi-VN"/>
         </w:rPr>
         <w:tab/>
-        <w:t>19</w:t>
+        <w:t>18</w:t>
       </w:r>
     </w:p>
     <w:p>
@@ -30853,7 +30853,7 @@
     <w:p>
       <w:pPr>
         <w:pStyle w:val="Heading2"/>
-        <w:pageBreakBefore/>
+        <w:pageBreakBefore w:val="0"/>
         <w:rPr>
           <w:lang w:val="vi-VN"/>
         </w:rPr>

</xml_diff>